<commit_message>
Explain why GrantScout uses a real MCP server, not just a function call
README and the Kaggle writeup previously described WHAT the two MCP tools
do but not WHY a standalone MCP server exists at all, versus wiring
search_grants/discover_grants as a plain in-process function. Add that
rationale in both places: reusability beyond this repo (any MCP client can
call the catalog without importing our Python), an enforced typed contract
at the tool boundary, and the tool as the natural choke point for the
prompt-injection/PII screening on untrusted web data. Regenerate the
submission .docx to match.

Co-Authored-By: Claude Fable 5 <noreply@anthropic.com>
</commit_message>
<xml_diff>
--- a/submission/GrantScout_Kaggle_Submission.docx
+++ b/submission/GrantScout_Kaggle_Submission.docx
@@ -507,7 +507,7 @@
         <w:pStyle w:val="Heading2"/>
       </w:pPr>
       <w:r>
-        <w:t xml:space="preserve">MCP server</w:t>
+        <w:t xml:space="preserve">MCP server: what it is, and why we built one instead of a plain function call</w:t>
       </w:r>
     </w:p>
     <w:p>
@@ -515,7 +515,7 @@
         <w:spacing w:after="120"/>
       </w:pPr>
       <w:r>
-        <w:t xml:space="preserve">mcp_server/server.py (FastMCP, stdio) exposes two tools:</w:t>
+        <w:t xml:space="preserve">The matcher’s core need is simple: given a profile, find candidate grants. We could have wired that as an in-process function and stopped there. Instead we built a standalone MCP server (mcp_server/server.py, FastMCP, stdio), for reasons beyond satisfying a checklist item:</w:t>
       </w:r>
     </w:p>
     <w:p>
@@ -529,14 +529,13 @@
       </w:pPr>
       <w:r>
         <w:rPr>
-          <w:rFonts w:ascii="Consolas" w:cs="Consolas" w:eastAsia="Consolas" w:hAnsi="Consolas"/>
-          <w:sz w:val="20"/>
-          <w:szCs w:val="20"/>
-        </w:rPr>
-        <w:t xml:space="preserve">search_grants(focus_areas, country, org_type, max_deadline)</w:t>
-      </w:r>
-      <w:r>
-        <w:t xml:space="preserve"> filters the curated catalog. Each grant carries structured eligibility_requirements ({code, value, label} records) so eligibility can be decided deterministically, plus a source attribution and funder URL.</w:t>
+          <w:b/>
+          <w:bCs/>
+        </w:rPr>
+        <w:t xml:space="preserve">Reusability beyond this repo. </w:t>
+      </w:r>
+      <w:r>
+        <w:t xml:space="preserve">MCP is a protocol, not a library import. Any MCP-aware client (Claude Desktop, another ADK agent, a future GrantScout CLI) can call search_grants without depending on GrantScout’s Python at all. The catalog becomes a shared capability, not a private implementation detail.</w:t>
       </w:r>
     </w:p>
     <w:p>
@@ -550,14 +549,33 @@
       </w:pPr>
       <w:r>
         <w:rPr>
-          <w:rFonts w:ascii="Consolas" w:cs="Consolas" w:eastAsia="Consolas" w:hAnsi="Consolas"/>
-          <w:sz w:val="20"/>
-          <w:szCs w:val="20"/>
-        </w:rPr>
-        <w:t xml:space="preserve">discover_grants(focus_areas, country)</w:t>
-      </w:r>
-      <w:r>
-        <w:t xml:space="preserve"> is an optional live-web freshness layer over public roundup pages. Every fetched description is screened for prompt injection and scrubbed of PII before it is returned; it is off by default and fails closed so it can never break the catalog spine.</w:t>
+          <w:b/>
+          <w:bCs/>
+        </w:rPr>
+        <w:t xml:space="preserve">An enforced contract at the boundary. </w:t>
+      </w:r>
+      <w:r>
+        <w:t xml:space="preserve">MCP tools declare typed inputs, so malformed calls are rejected (ValueError) before they touch the catalog: real boundary discipline between “things an LLM might invoke” and “things that actually read state.”</w:t>
+      </w:r>
+    </w:p>
+    <w:p>
+      <w:pPr>
+        <w:pStyle w:val="ListParagraph"/>
+        <w:numPr>
+          <w:ilvl w:val="0"/>
+          <w:numId w:val="3"/>
+        </w:numPr>
+        <w:spacing w:after="80"/>
+      </w:pPr>
+      <w:r>
+        <w:rPr>
+          <w:b/>
+          <w:bCs/>
+        </w:rPr>
+        <w:t xml:space="preserve">A natural choke point for risk containment. </w:t>
+      </w:r>
+      <w:r>
+        <w:t xml:space="preserve">discover_grants is where untrusted web data enters the system. Putting the prompt-injection screen and PII scrub inside the tool means every caller gets that safety automatically, rather than depending on each caller remembering to sanitize afterward.</w:t>
       </w:r>
     </w:p>
     <w:p>
@@ -565,7 +583,15 @@
         <w:spacing w:after="120"/>
       </w:pPr>
       <w:r>
-        <w:t xml:space="preserve">The same implementations back both the MCP server and the in-process matcher, so the tool contract is identical over MCP or direct calls.</w:t>
+        <w:t xml:space="preserve">It exposes two tools. search_grants(focus_areas, country, org_type, max_deadline) filters the curated catalog, returning structured eligibility_requirements ({code, value, label} records) plus a source attribution and funder URL for each grant. discover_grants(focus_areas, country) is the optional live-web freshness layer described above; it fails closed (returns []) so it can never break the catalog spine.</w:t>
+      </w:r>
+    </w:p>
+    <w:p>
+      <w:pPr>
+        <w:spacing w:after="120"/>
+      </w:pPr>
+      <w:r>
+        <w:t xml:space="preserve">The graph itself still needs to run offline and deterministically (including in CI, no network, no subprocess), so the actual filtering logic lives once in catalog_search.py/discovery.py; the MCP server and the in-process matcher are both thin callers of that same logic, with identical validation and screening either way. The MCP layer is a real, independently runnable protocol server, not a facade that only works when this one agent calls it.</w:t>
       </w:r>
     </w:p>
     <w:p>

</xml_diff>